<commit_message>
Login con 3 intentos y bloqueo en el servidor, clave monster69; clientes como el GR05 (ec.edu.monster, modelo get/set, controlador delgado) con imagen; docs, diagramas y capturas actualizados
</commit_message>
<xml_diff>
--- a/01. UML/01. ERS/ERS_CONVERSION_UNIDADES_RESTFUL_DOTNET_GR01.docx
+++ b/01. UML/01. ERS/ERS_CONVERSION_UNIDADES_RESTFUL_DOTNET_GR01.docx
@@ -2786,7 +2786,7 @@
                 <w:sz w:val="20"/>
                 <w:szCs w:val="20"/>
               </w:rPr>
-              <w:t xml:space="preserve">El sistema debe validar usuario y clave enviando POST /api/autenticacion/login con un JSON { usuario, clave }. Las credenciales residen solo en el servidor (appsettings.json). Respuesta 200 si son correctas y 401 si no.</w:t>
+              <w:t xml:space="preserve">El sistema debe validar usuario y clave enviando POST /api/autenticacion/login con un JSON { usuario, clave }. Las credenciales residen solo en el servidor (appsettings.json). Respuesta 200 si son correctas y 401 con un mensaje (intentos restantes o usuario bloqueado) si no.</w:t>
             </w:r>
           </w:p>
         </w:tc>
@@ -2915,7 +2915,7 @@
                 <w:sz w:val="20"/>
                 <w:szCs w:val="20"/>
               </w:rPr>
-              <w:t xml:space="preserve">Después de 3 intentos fallidos el cliente debe bloquear el ingreso e informar al usuario.</w:t>
+              <w:t xml:space="preserve">El servidor cuenta los intentos fallidos por usuario: informa los intentos restantes y, al tercero, bloquea al usuario 2 minutos. Los clientes solo muestran el mensaje.</w:t>
             </w:r>
           </w:p>
         </w:tc>
@@ -5527,7 +5527,7 @@
                 <w:sz w:val="20"/>
                 <w:szCs w:val="20"/>
               </w:rPr>
-              <w:t xml:space="preserve">200 { autenticado, usuario, mensaje } · 401 CREDENCIALES_INVALIDAS</w:t>
+              <w:t xml:space="preserve">200 { autenticado, usuario, mensaje } · 401 REGLA_NEGOCIO (intentos restantes o bloqueo) · 400 VALOR_INVALIDO</w:t>
             </w:r>
           </w:p>
         </w:tc>

</xml_diff>